<commit_message>
fix(templates): the signing annex and agreement take the review's wording, the agreement names no countersigner and refuses a client without its representative, and the new hire's clause is text the engine gives
The agreement no longer claims Legea 214/2024 art. 4 (5) c), which needs a handwritten or qualified signature on the separate writing; it rests on Codul muncii art. 16 and art. 5 (3) of Legea 214/2024, carries a paper number line, takes effect once both parties have signed, and says when a withdrawal takes effect. The annex states the eIDAS properties as the platform makes them, the two signatures of the fire-safety sheet, keeping and archiving, the consultation of the employees' representatives and a line for it, and keeps to one page at 10 pt with long names.
</commit_message>
<xml_diff>
--- a/packages/document-engine/templates/13_signing_regulation_annex.docx
+++ b/packages/document-engine/templates/13_signing_regulation_annex.docx
@@ -63,13 +63,13 @@
     <w:p>
       <w:pPr>
         <w:pStyle w:val="Normal"/>
-        <w:keepNext/>
+        <w:keepNext w:val="false"/>
         <w:numPr>
           <w:ilvl w:val="0"/>
           <w:numId w:val="1"/>
         </w:numPr>
         <w:bidi w:val="0"/>
-        <w:spacing w:before="0" w:after="120"/>
+        <w:spacing w:before="0" w:after="60"/>
         <w:ind w:hanging="0" w:left="0"/>
         <w:jc w:val="left"/>
         <w:rPr>
@@ -90,172 +90,7 @@
           <w:sz w:val="20"/>
           <w:lang w:val="ro-RO"/>
         </w:rPr>
-        <w:t>Prezenta anexă la regulamentul intern al {{client.legalName}} stabilește modul de semnare electronică a fișelor de instruire, în temeiul:</w:t>
-      </w:r>
-    </w:p>
-    <w:p>
-      <w:pPr>
-        <w:pStyle w:val="Normal"/>
-        <w:keepNext w:val="false"/>
-        <w:numPr>
-          <w:ilvl w:val="0"/>
-          <w:numId w:val="0"/>
-        </w:numPr>
-        <w:bidi w:val="0"/>
-        <w:spacing w:before="0" w:after="60"/>
-        <w:ind w:hanging="360" w:left="720"/>
-        <w:jc w:val="left"/>
-        <w:rPr>
-          <w:rFonts w:ascii="Arial" w:hAnsi="Arial" w:eastAsia="Arial" w:cs="Arial"/>
-          <w:b w:val="false"/>
-          <w:i w:val="false"/>
-          <w:color w:val="auto"/>
-          <w:sz w:val="20"/>
-          <w:lang w:val="ro-RO"/>
-        </w:rPr>
-      </w:pPr>
-      <w:r>
-        <w:rPr>
-          <w:rFonts w:eastAsia="Arial" w:cs="Arial" w:ascii="Arial" w:hAnsi="Arial"/>
-          <w:b w:val="false"/>
-          <w:i w:val="false"/>
-          <w:color w:val="auto"/>
-          <w:sz w:val="20"/>
-          <w:lang w:val="ro-RO"/>
-        </w:rPr>
-        <w:t>a) art. 81 alin. (3¹)–(3³) din H.G. 1425/2006;</w:t>
-      </w:r>
-    </w:p>
-    <w:p>
-      <w:pPr>
-        <w:pStyle w:val="Normal"/>
-        <w:keepNext w:val="false"/>
-        <w:numPr>
-          <w:ilvl w:val="0"/>
-          <w:numId w:val="0"/>
-        </w:numPr>
-        <w:bidi w:val="0"/>
-        <w:spacing w:before="0" w:after="60"/>
-        <w:ind w:hanging="360" w:left="720"/>
-        <w:jc w:val="left"/>
-        <w:rPr>
-          <w:rFonts w:ascii="Arial" w:hAnsi="Arial" w:eastAsia="Arial" w:cs="Arial"/>
-          <w:b w:val="false"/>
-          <w:i w:val="false"/>
-          <w:color w:val="auto"/>
-          <w:sz w:val="20"/>
-          <w:lang w:val="ro-RO"/>
-        </w:rPr>
-      </w:pPr>
-      <w:r>
-        <w:rPr>
-          <w:rFonts w:eastAsia="Arial" w:cs="Arial" w:ascii="Arial" w:hAnsi="Arial"/>
-          <w:b w:val="false"/>
-          <w:i w:val="false"/>
-          <w:color w:val="auto"/>
-          <w:sz w:val="20"/>
-          <w:lang w:val="ro-RO"/>
-        </w:rPr>
-        <w:t>b) art. 16 alin. (1¹)–(1⁸) din Legea 53/2003 – Codul muncii;</w:t>
-      </w:r>
-    </w:p>
-    <w:p>
-      <w:pPr>
-        <w:pStyle w:val="Normal"/>
-        <w:keepNext w:val="false"/>
-        <w:numPr>
-          <w:ilvl w:val="0"/>
-          <w:numId w:val="0"/>
-        </w:numPr>
-        <w:bidi w:val="0"/>
-        <w:spacing w:before="0" w:after="60"/>
-        <w:ind w:hanging="360" w:left="720"/>
-        <w:jc w:val="left"/>
-        <w:rPr>
-          <w:rFonts w:ascii="Arial" w:hAnsi="Arial" w:eastAsia="Arial" w:cs="Arial"/>
-          <w:b w:val="false"/>
-          <w:i w:val="false"/>
-          <w:color w:val="auto"/>
-          <w:sz w:val="20"/>
-          <w:lang w:val="ro-RO"/>
-        </w:rPr>
-      </w:pPr>
-      <w:r>
-        <w:rPr>
-          <w:rFonts w:eastAsia="Arial" w:cs="Arial" w:ascii="Arial" w:hAnsi="Arial"/>
-          <w:b w:val="false"/>
-          <w:i w:val="false"/>
-          <w:color w:val="auto"/>
-          <w:sz w:val="20"/>
-          <w:lang w:val="ro-RO"/>
-        </w:rPr>
-        <w:t>c) art. 17 alin. (3) lit. o) din Legea 53/2003;</w:t>
-      </w:r>
-    </w:p>
-    <w:p>
-      <w:pPr>
-        <w:pStyle w:val="Normal"/>
-        <w:keepNext w:val="false"/>
-        <w:numPr>
-          <w:ilvl w:val="0"/>
-          <w:numId w:val="0"/>
-        </w:numPr>
-        <w:bidi w:val="0"/>
-        <w:spacing w:before="0" w:after="60"/>
-        <w:ind w:hanging="360" w:left="720"/>
-        <w:jc w:val="left"/>
-        <w:rPr>
-          <w:rFonts w:ascii="Arial" w:hAnsi="Arial" w:eastAsia="Arial" w:cs="Arial"/>
-          <w:b w:val="false"/>
-          <w:i w:val="false"/>
-          <w:color w:val="auto"/>
-          <w:sz w:val="20"/>
-          <w:lang w:val="ro-RO"/>
-        </w:rPr>
-      </w:pPr>
-      <w:r>
-        <w:rPr>
-          <w:rFonts w:eastAsia="Arial" w:cs="Arial" w:ascii="Arial" w:hAnsi="Arial"/>
-          <w:b w:val="false"/>
-          <w:i w:val="false"/>
-          <w:color w:val="auto"/>
-          <w:sz w:val="20"/>
-          <w:lang w:val="ro-RO"/>
-        </w:rPr>
-        <w:t>d) art. 4 din Legea 214/2024 privind utilizarea semnăturii electronice;</w:t>
-      </w:r>
-    </w:p>
-    <w:p>
-      <w:pPr>
-        <w:pStyle w:val="Normal"/>
-        <w:keepNext w:val="false"/>
-        <w:numPr>
-          <w:ilvl w:val="0"/>
-          <w:numId w:val="0"/>
-        </w:numPr>
-        <w:bidi w:val="0"/>
-        <w:spacing w:before="0" w:after="120"/>
-        <w:ind w:hanging="360" w:left="720"/>
-        <w:jc w:val="left"/>
-        <w:rPr>
-          <w:rFonts w:ascii="Arial" w:hAnsi="Arial" w:eastAsia="Arial" w:cs="Arial"/>
-          <w:b w:val="false"/>
-          <w:i w:val="false"/>
-          <w:color w:val="auto"/>
-          <w:sz w:val="20"/>
-          <w:lang w:val="ro-RO"/>
-        </w:rPr>
-      </w:pPr>
-      <w:r>
-        <w:rPr>
-          <w:rFonts w:eastAsia="Arial" w:cs="Arial" w:ascii="Arial" w:hAnsi="Arial"/>
-          <w:b w:val="false"/>
-          <w:i w:val="false"/>
-          <w:color w:val="auto"/>
-          <w:sz w:val="20"/>
-          <w:lang w:val="ro-RO"/>
-        </w:rPr>
-        <w:t>e) art. 26 din Regulamentul (UE) nr. 910/2014 (eIDAS).</w:t>
+        <w:t>Prezenta anexă la regulamentul intern al {{client.legalName}} stabilește modul de semnare electronică a fișelor de instruire, în temeiul art. 81 alin. (3¹)–(3³) din H.G. 1425/2006, al art. 16 alin. (1²), (1³) și (1⁶)–(1⁸) din Legea 53/2003 – Codul muncii, al art. 17 alin. (3) lit. o) din Legea 53/2003, al art. 4 din Legea 214/2024 privind utilizarea semnăturii electronice și al art. 26 din Regulamentul (UE) nr. 910/2014 (eIDAS).</w:t>
       </w:r>
     </w:p>
     <w:p>
@@ -267,7 +102,7 @@
           <w:numId w:val="1"/>
         </w:numPr>
         <w:bidi w:val="0"/>
-        <w:spacing w:before="0" w:after="120"/>
+        <w:spacing w:before="0" w:after="60"/>
         <w:ind w:hanging="0" w:left="0"/>
         <w:jc w:val="left"/>
         <w:rPr>
@@ -288,7 +123,7 @@
           <w:sz w:val="20"/>
           <w:lang w:val="ro-RO"/>
         </w:rPr>
-        <w:t>Se semnează electronic fișele individuale de instruire în domeniul securității și sănătății în muncă (anexa nr. 11 la H.G. 1425/2006) și fișele individuale de instructaj în domeniul situațiilor de urgență (OMAI 712/2005), rând cu rând, pentru fiecare instruire consemnată, de lucrătorul instruit, de cel care a efectuat instruirea și de cel care a verificat-o, iar rubrica „Admis la lucru”, de cel care l-a admis la lucru. Alte documente se semnează electronic numai după ce sunt adăugate în prezenta anexă.</w:t>
+        <w:t>Se semnează electronic fișele individuale de instruire în domeniul securității și sănătății în muncă (anexa nr. 11 la H.G. 1425/2006) și fișele individuale de instructaj în domeniul situațiilor de urgență (OMAI 712/2005), rând cu rând, pentru fiecare instruire consemnată, de lucrătorul instruit și de cel care a efectuat instruirea, iar pe fișa de securitate și sănătate în muncă și de cel care a verificat însușirea cunoștințelor; rubrica „Admis la lucru” a acestei fișe se semnează de cel care l-a admis la lucru. Alte documente se semnează electronic numai după ce sunt adăugate în prezenta anexă.</w:t>
       </w:r>
     </w:p>
     <w:p>
@@ -300,7 +135,7 @@
           <w:numId w:val="1"/>
         </w:numPr>
         <w:bidi w:val="0"/>
-        <w:spacing w:before="0" w:after="120"/>
+        <w:spacing w:before="0" w:after="60"/>
         <w:ind w:hanging="0" w:left="0"/>
         <w:jc w:val="left"/>
         <w:rPr>
@@ -321,7 +156,7 @@
           <w:sz w:val="20"/>
           <w:lang w:val="ro-RO"/>
         </w:rPr>
-        <w:t>Fișele se semnează cu semnătură electronică avansată în sensul art. 26 din Regulamentul (UE) nr. 910/2014, fără certificat calificat, creată în platforma pusă la dispoziție de {{provider.legalName}}, prestatorul de servicii de securitate și sănătate în muncă al angajatorului. Semnătura identifică în mod unic semnatarul, se creează numai cu un cod aflat sub controlul său exclusiv și este legată de fișă astfel încât orice modificare ulterioară poate fi detectată.</w:t>
+        <w:t>Fișele se semnează cu semnătură electronică avansată în sensul art. 26 din Regulamentul (UE) nr. 910/2014, fără certificat calificat, creată în platforma pusă la dispoziție de {{provider.legalName}}, serviciul extern de prevenire și protecție al angajatorului. Fiecare semnatar are o cheie de semnare proprie, cu un certificat emis de platformă pe numele său, păstrată criptat în platformă. Cheia se folosește numai după ce semnatarul introduce codul de unică folosință primit la adresa sa, astfel încât semnătura face trimitere exclusiv la semnatar, permite identificarea lui, este creată cu date pe care acesta le poate utiliza, cu un nivel ridicat de încredere, exclusiv sub controlul său și este legată de fișă astfel încât orice modificare ulterioară poate fi detectată.</w:t>
       </w:r>
     </w:p>
     <w:p>
@@ -333,7 +168,7 @@
           <w:numId w:val="1"/>
         </w:numPr>
         <w:bidi w:val="0"/>
-        <w:spacing w:before="0" w:after="120"/>
+        <w:spacing w:before="0" w:after="60"/>
         <w:ind w:hanging="0" w:left="0"/>
         <w:jc w:val="left"/>
         <w:rPr>
@@ -354,7 +189,7 @@
           <w:sz w:val="20"/>
           <w:lang w:val="ro-RO"/>
         </w:rPr>
-        <w:t>Fiecare semnatar semnează din contul său personal, deschis pe adresa de e-mail sau pe numărul de telefon mobil comunicat angajatorului (ori prestatorului, pentru personalul acestuia). La fiecare semnare, platforma trimite acolo un cod de unică folosință, iar semnătura se creează numai după introducerea codului, pentru documentele afișate la cererea codului. Se înregistrează numele și funcția semnatarului, momentul semnării, adresa sau numărul unde s-a trimis codul și conținutul semnat.</w:t>
+        <w:t>Fiecare semnatar semnează din contul său personal, deschis pe adresa de e-mail sau pe numărul de telefon mobil comunicat angajatorului (ori serviciului extern de prevenire și protecție, pentru personalul acestuia). La fiecare semnare, platforma trimite acolo un cod de unică folosință, iar un cod semnează numai documentele afișate semnatarului în momentul în care l-a cerut. Se înregistrează numele și funcția semnatarului, momentul semnării, adresa de e-mail sau numărul de telefon la care s-a trimis codul, adresa IP și browserul folosite și amprenta digitală a fișei înainte și după semnare.</w:t>
       </w:r>
     </w:p>
     <w:p>
@@ -366,7 +201,7 @@
           <w:numId w:val="1"/>
         </w:numPr>
         <w:bidi w:val="0"/>
-        <w:spacing w:before="0" w:after="120"/>
+        <w:spacing w:before="0" w:after="60"/>
         <w:ind w:hanging="0" w:left="0"/>
         <w:jc w:val="left"/>
         <w:rPr>
@@ -387,7 +222,7 @@
           <w:sz w:val="20"/>
           <w:lang w:val="ro-RO"/>
         </w:rPr>
-        <w:t>Cererea de semnare se transmite după consemnarea instruirii în platformă, iar semnatarii semnează de pe telefon sau de pe calculator. Un rând semnat al fișei nu mai poate fi modificat: o greșeală se corectează prin anularea rândului, care rămâne pe fișă cu mențiunea „anulat”, și prin consemnarea instruirii pe rândul următor, care se semnează din nou.</w:t>
+        <w:t>Un rând semnat al fișei nu mai poate fi modificat: o greșeală se corectează prin anularea rândului, care rămâne pe fișă cu mențiunea „anulat”, și prin consemnarea instruirii pe rândul următor, care se semnează din nou.</w:t>
       </w:r>
     </w:p>
     <w:p>
@@ -399,7 +234,7 @@
           <w:numId w:val="1"/>
         </w:numPr>
         <w:bidi w:val="0"/>
-        <w:spacing w:before="0" w:after="120"/>
+        <w:spacing w:before="0" w:after="60"/>
         <w:ind w:hanging="0" w:left="0"/>
         <w:jc w:val="left"/>
         <w:rPr>
@@ -420,7 +255,7 @@
           <w:sz w:val="20"/>
           <w:lang w:val="ro-RO"/>
         </w:rPr>
-        <w:t>Fișa semnată electronic se păstrează în platformă de la angajare până la încetarea raportului de muncă (art. 81 alin. (5) din H.G. 1425/2006), poate fi descărcată oricând de angajator, cu semnăturile verificabile, și se pune la dispoziția organelor de control în format electronic, fără a fi tipărită (art. 16 alin. (1⁸) din Legea 53/2003). Arhivarea se face potrivit Legii 16/1996 și Legii 135/2007.</w:t>
+        <w:t>Fișa semnată electronic se păstrează de angajator, în format electronic, de la angajare până la data încetării raporturilor de muncă (art. 81 alin. (4) și (5) din H.G. 1425/2006). Angajatorul o poate descărca oricând din platformă, cu semnăturile verificabile, și o pune la dispoziția organelor de control în format electronic, fără a le fi solicitată și în format letric (art. 16 alin. (1⁸) din Legea 53/2003). Fișa se arhivează potrivit Legii 16/1996 și Legii 135/2007 (art. 16 alin. (1³) din Legea 53/2003).</w:t>
       </w:r>
     </w:p>
     <w:p>
@@ -432,7 +267,7 @@
           <w:numId w:val="1"/>
         </w:numPr>
         <w:bidi w:val="0"/>
-        <w:spacing w:before="0" w:after="120"/>
+        <w:spacing w:before="0" w:after="60"/>
         <w:ind w:hanging="0" w:left="0"/>
         <w:jc w:val="left"/>
         <w:rPr>
@@ -453,7 +288,7 @@
           <w:sz w:val="20"/>
           <w:lang w:val="ro-RO"/>
         </w:rPr>
-        <w:t>Salariatul nu poate fi obligat să semneze electronic (art. 16 alin. (1⁶) din Legea 53/2003); cel care nu optează pentru semnătura electronică semnează olograf fișa tipărită. Opțiunea salariatului și procedura de semnare se consemnează în contractul individual de muncă, la angajare, sau printr-un act adițional la acesta (art. 81 alin. (3²) din H.G. 1425/2006).</w:t>
+        <w:t>Semnarea electronică a fișelor salariatului se convine prin contractul individual de muncă sau printr-un act adițional la acesta (art. 81 alin. (3²) din H.G. 1425/2006), pe care salariatul nu poate fi obligat să îl semneze electronic (art. 16 alin. (1⁶) din Legea 53/2003). Salariatul care nu îl încheie semnează olograf fișa tipărită, iar cel care l-a încheiat poate reveni oricând la semnarea olografă, printr-o cerere scrisă.</w:t>
       </w:r>
     </w:p>
     <w:p>
@@ -465,7 +300,7 @@
           <w:numId w:val="1"/>
         </w:numPr>
         <w:bidi w:val="0"/>
-        <w:spacing w:before="0" w:after="120"/>
+        <w:spacing w:before="0" w:after="60"/>
         <w:ind w:hanging="0" w:left="0"/>
         <w:jc w:val="left"/>
         <w:rPr>
@@ -486,7 +321,7 @@
           <w:sz w:val="20"/>
           <w:lang w:val="ro-RO"/>
         </w:rPr>
-        <w:t>Anexa produce efecte față de salariat de la luarea la cunoștință (art. 243 din Legea 53/2003).</w:t>
+        <w:t>Anexa se întocmește cu consultarea sindicatului sau a reprezentanților salariaților, după caz (art. 241 din Legea 53/2003), se aduce la cunoștința fiecărui salariat, pe hârtie sau în format electronic, se afișează la sediul angajatorului și produce efecte față de salariat de la luarea la cunoștință (art. 243 din Legea 53/2003).</w:t>
       </w:r>
     </w:p>
     <w:tbl>
@@ -549,7 +384,7 @@
               <w:pStyle w:val="TableContents"/>
               <w:keepNext w:val="false"/>
               <w:bidi w:val="0"/>
-              <w:spacing w:before="680" w:after="0"/>
+              <w:spacing w:before="360" w:after="0"/>
               <w:ind w:hanging="0" w:left="0"/>
               <w:jc w:val="center"/>
               <w:rPr>
@@ -599,36 +434,7 @@
                 <w:sz w:val="20"/>
                 <w:lang w:val="ro-RO"/>
               </w:rPr>
-              <w:t>{{client.representativeRole}} al {{client.legalName}}</w:t>
-            </w:r>
-          </w:p>
-          <w:p>
-            <w:pPr>
-              <w:pStyle w:val="TableContents"/>
-              <w:keepNext w:val="false"/>
-              <w:bidi w:val="0"/>
-              <w:spacing w:before="120" w:after="0"/>
-              <w:ind w:hanging="0" w:left="0"/>
-              <w:jc w:val="center"/>
-              <w:rPr>
-                <w:rFonts w:ascii="Arial" w:hAnsi="Arial" w:eastAsia="Arial" w:cs="Arial"/>
-                <w:b w:val="false"/>
-                <w:i w:val="false"/>
-                <w:color w:val="auto"/>
-                <w:sz w:val="20"/>
-                <w:lang w:val="ro-RO"/>
-              </w:rPr>
-            </w:pPr>
-            <w:r>
-              <w:rPr>
-                <w:rFonts w:eastAsia="Arial" w:cs="Arial" w:ascii="Arial" w:hAnsi="Arial"/>
-                <w:b w:val="false"/>
-                <w:i w:val="false"/>
-                <w:color w:val="auto"/>
-                <w:sz w:val="20"/>
-                <w:lang w:val="ro-RO"/>
-              </w:rPr>
-              <w:t>Data: ____________________</w:t>
+              <w:t>{{client.representativeRole}}</w:t>
             </w:r>
           </w:p>
         </w:tc>
@@ -671,7 +477,7 @@
               <w:pStyle w:val="TableContents"/>
               <w:keepNext w:val="false"/>
               <w:bidi w:val="0"/>
-              <w:spacing w:before="680" w:after="0"/>
+              <w:spacing w:before="360" w:after="0"/>
               <w:ind w:hanging="0" w:left="0"/>
               <w:jc w:val="center"/>
               <w:rPr>
@@ -721,36 +527,7 @@
                 <w:sz w:val="20"/>
                 <w:lang w:val="ro-RO"/>
               </w:rPr>
-              <w:t>{{specialist.professionalTitle}}, {{provider.legalName}}</w:t>
-            </w:r>
-          </w:p>
-          <w:p>
-            <w:pPr>
-              <w:pStyle w:val="TableContents"/>
-              <w:keepNext w:val="false"/>
-              <w:bidi w:val="0"/>
-              <w:spacing w:before="120" w:after="0"/>
-              <w:ind w:hanging="0" w:left="0"/>
-              <w:jc w:val="center"/>
-              <w:rPr>
-                <w:rFonts w:ascii="Arial" w:hAnsi="Arial" w:eastAsia="Arial" w:cs="Arial"/>
-                <w:b w:val="false"/>
-                <w:i w:val="false"/>
-                <w:color w:val="auto"/>
-                <w:sz w:val="20"/>
-                <w:lang w:val="ro-RO"/>
-              </w:rPr>
-            </w:pPr>
-            <w:r>
-              <w:rPr>
-                <w:rFonts w:eastAsia="Arial" w:cs="Arial" w:ascii="Arial" w:hAnsi="Arial"/>
-                <w:b w:val="false"/>
-                <w:i w:val="false"/>
-                <w:color w:val="auto"/>
-                <w:sz w:val="20"/>
-                <w:lang w:val="ro-RO"/>
-              </w:rPr>
-              <w:t>Data: ____________________</w:t>
+              <w:t>{{specialist.professionalTitle}}</w:t>
             </w:r>
           </w:p>
         </w:tc>
@@ -773,7 +550,7 @@
           <w:b w:val="false"/>
           <w:i w:val="false"/>
           <w:color w:val="auto"/>
-          <w:sz w:val="2"/>
+          <w:sz w:val="20"/>
           <w:lang w:val="ro-RO"/>
         </w:rPr>
       </w:pPr>
@@ -783,9 +560,10 @@
           <w:b w:val="false"/>
           <w:i w:val="false"/>
           <w:color w:val="auto"/>
-          <w:sz w:val="2"/>
+          <w:sz w:val="20"/>
           <w:lang w:val="ro-RO"/>
         </w:rPr>
+        <w:t>Consultat: ________________________, reprezentant al salariaților / sindicat, data __________</w:t>
       </w:r>
     </w:p>
     <w:sectPr>

</xml_diff>